<commit_message>
Se actualizan variables y tabla-
</commit_message>
<xml_diff>
--- a/vista/plantilla_acta_inicio_1.docx
+++ b/vista/plantilla_acta_inicio_1.docx
@@ -518,10 +518,20 @@
               <w:rPr>
                 <w:rFonts w:ascii="Arial" w:eastAsia="Arial" w:hAnsi="Arial" w:cs="Arial"/>
                 <w:b/>
+                <w:bCs/>
                 <w:sz w:val="19"/>
                 <w:szCs w:val="19"/>
               </w:rPr>
-              <w:t>SP. ${</w:t>
+              <w:t>Sargento Viceprimero</w:t>
+            </w:r>
+            <w:r>
+              <w:rPr>
+                <w:rFonts w:ascii="Arial" w:eastAsia="Arial" w:hAnsi="Arial" w:cs="Arial"/>
+                <w:b/>
+                <w:sz w:val="19"/>
+                <w:szCs w:val="19"/>
+              </w:rPr>
+              <w:t xml:space="preserve"> ${</w:t>
             </w:r>
             <w:proofErr w:type="spellStart"/>
             <w:r>
@@ -590,6 +600,44 @@
               </w:rPr>
               <w:t>}</w:t>
             </w:r>
+            <w:r>
+              <w:rPr>
+                <w:rFonts w:ascii="Arial" w:eastAsia="Arial" w:hAnsi="Arial" w:cs="Arial"/>
+                <w:b/>
+                <w:sz w:val="19"/>
+                <w:szCs w:val="19"/>
+              </w:rPr>
+              <w:t>-</w:t>
+            </w:r>
+            <w:r>
+              <w:rPr>
+                <w:rFonts w:ascii="Arial" w:eastAsia="Arial" w:hAnsi="Arial" w:cs="Arial"/>
+                <w:b/>
+                <w:sz w:val="18"/>
+                <w:szCs w:val="18"/>
+              </w:rPr>
+              <w:t>DMMED-${</w:t>
+            </w:r>
+            <w:proofErr w:type="spellStart"/>
+            <w:r>
+              <w:rPr>
+                <w:rFonts w:ascii="Arial" w:eastAsia="Arial" w:hAnsi="Arial" w:cs="Arial"/>
+                <w:b/>
+                <w:sz w:val="18"/>
+                <w:szCs w:val="18"/>
+              </w:rPr>
+              <w:t>anio_contrato</w:t>
+            </w:r>
+            <w:proofErr w:type="spellEnd"/>
+            <w:r>
+              <w:rPr>
+                <w:rFonts w:ascii="Arial" w:eastAsia="Arial" w:hAnsi="Arial" w:cs="Arial"/>
+                <w:b/>
+                <w:sz w:val="18"/>
+                <w:szCs w:val="18"/>
+              </w:rPr>
+              <w:t>}</w:t>
+            </w:r>
           </w:p>
           <w:p>
             <w:pPr>
@@ -628,23 +676,32 @@
                 <w:sz w:val="19"/>
                 <w:szCs w:val="19"/>
               </w:rPr>
-              <w:t>} con NIT. ${</w:t>
-            </w:r>
-            <w:proofErr w:type="spellStart"/>
-            <w:r>
-              <w:rPr>
-                <w:rFonts w:ascii="Arial" w:eastAsia="Arial" w:hAnsi="Arial" w:cs="Arial"/>
-                <w:b/>
+              <w:t xml:space="preserve">} </w:t>
+            </w:r>
+            <w:r>
+              <w:rPr>
+                <w:rFonts w:ascii="Arial" w:eastAsia="Arial" w:hAnsi="Arial" w:cs="Arial"/>
+                <w:bCs/>
                 <w:sz w:val="19"/>
                 <w:szCs w:val="19"/>
               </w:rPr>
+              <w:t>con NIT. ${</w:t>
+            </w:r>
+            <w:proofErr w:type="spellStart"/>
+            <w:r>
+              <w:rPr>
+                <w:rFonts w:ascii="Arial" w:eastAsia="Arial" w:hAnsi="Arial" w:cs="Arial"/>
+                <w:bCs/>
+                <w:sz w:val="19"/>
+                <w:szCs w:val="19"/>
+              </w:rPr>
               <w:t>nit_contratista</w:t>
             </w:r>
             <w:proofErr w:type="spellEnd"/>
             <w:r>
               <w:rPr>
                 <w:rFonts w:ascii="Arial" w:eastAsia="Arial" w:hAnsi="Arial" w:cs="Arial"/>
-                <w:b/>
+                <w:bCs/>
                 <w:sz w:val="19"/>
                 <w:szCs w:val="19"/>
               </w:rPr>
@@ -716,9 +773,8 @@
                 <w:sz w:val="19"/>
                 <w:szCs w:val="19"/>
               </w:rPr>
-              <w:t>identificado con cedula ciudadanía No. ${</w:t>
-            </w:r>
-            <w:proofErr w:type="spellStart"/>
+              <w:t>CC</w:t>
+            </w:r>
             <w:r>
               <w:rPr>
                 <w:rFonts w:ascii="Arial" w:eastAsia="Arial" w:hAnsi="Arial" w:cs="Arial"/>
@@ -726,9 +782,9 @@
                 <w:sz w:val="19"/>
                 <w:szCs w:val="19"/>
               </w:rPr>
-              <w:t>cedula_contratista</w:t>
-            </w:r>
-            <w:proofErr w:type="spellEnd"/>
+              <w:t xml:space="preserve"> No. ${</w:t>
+            </w:r>
+            <w:proofErr w:type="spellStart"/>
             <w:r>
               <w:rPr>
                 <w:rFonts w:ascii="Arial" w:eastAsia="Arial" w:hAnsi="Arial" w:cs="Arial"/>
@@ -736,7 +792,35 @@
                 <w:sz w:val="19"/>
                 <w:szCs w:val="19"/>
               </w:rPr>
-              <w:t>} de ${</w:t>
+              <w:t>cedula_contratista</w:t>
+            </w:r>
+            <w:proofErr w:type="spellEnd"/>
+            <w:r>
+              <w:rPr>
+                <w:rFonts w:ascii="Arial" w:eastAsia="Arial" w:hAnsi="Arial" w:cs="Arial"/>
+                <w:color w:val="000000"/>
+                <w:sz w:val="19"/>
+                <w:szCs w:val="19"/>
+              </w:rPr>
+              <w:t xml:space="preserve">} </w:t>
+            </w:r>
+            <w:r>
+              <w:rPr>
+                <w:rFonts w:ascii="Arial" w:eastAsia="Arial" w:hAnsi="Arial" w:cs="Arial"/>
+                <w:color w:val="000000"/>
+                <w:sz w:val="19"/>
+                <w:szCs w:val="19"/>
+              </w:rPr>
+              <w:t>expedida en</w:t>
+            </w:r>
+            <w:r>
+              <w:rPr>
+                <w:rFonts w:ascii="Arial" w:eastAsia="Arial" w:hAnsi="Arial" w:cs="Arial"/>
+                <w:color w:val="000000"/>
+                <w:sz w:val="19"/>
+                <w:szCs w:val="19"/>
+              </w:rPr>
+              <w:t xml:space="preserve"> ${</w:t>
             </w:r>
             <w:proofErr w:type="spellStart"/>
             <w:r>
@@ -843,6 +927,44 @@
                 <w:szCs w:val="18"/>
               </w:rPr>
               <w:t>numero_contrato</w:t>
+            </w:r>
+            <w:proofErr w:type="spellEnd"/>
+            <w:r>
+              <w:rPr>
+                <w:rFonts w:ascii="Arial" w:eastAsia="Arial" w:hAnsi="Arial" w:cs="Arial"/>
+                <w:b/>
+                <w:sz w:val="18"/>
+                <w:szCs w:val="18"/>
+              </w:rPr>
+              <w:t>}</w:t>
+            </w:r>
+            <w:r>
+              <w:rPr>
+                <w:rFonts w:ascii="Arial" w:eastAsia="Arial" w:hAnsi="Arial" w:cs="Arial"/>
+                <w:b/>
+                <w:sz w:val="18"/>
+                <w:szCs w:val="18"/>
+              </w:rPr>
+              <w:t>-</w:t>
+            </w:r>
+            <w:r>
+              <w:rPr>
+                <w:rFonts w:ascii="Arial" w:eastAsia="Arial" w:hAnsi="Arial" w:cs="Arial"/>
+                <w:b/>
+                <w:sz w:val="18"/>
+                <w:szCs w:val="18"/>
+              </w:rPr>
+              <w:t>DMMED-${</w:t>
+            </w:r>
+            <w:proofErr w:type="spellStart"/>
+            <w:r>
+              <w:rPr>
+                <w:rFonts w:ascii="Arial" w:eastAsia="Arial" w:hAnsi="Arial" w:cs="Arial"/>
+                <w:b/>
+                <w:sz w:val="18"/>
+                <w:szCs w:val="18"/>
+              </w:rPr>
+              <w:t>anio_contrato</w:t>
             </w:r>
             <w:proofErr w:type="spellEnd"/>
             <w:r>
@@ -1197,6 +1319,44 @@
               </w:rPr>
               <w:t>}</w:t>
             </w:r>
+            <w:r>
+              <w:rPr>
+                <w:rFonts w:ascii="Arial" w:eastAsia="Arial" w:hAnsi="Arial" w:cs="Arial"/>
+                <w:b/>
+                <w:sz w:val="17"/>
+                <w:szCs w:val="17"/>
+              </w:rPr>
+              <w:t>-</w:t>
+            </w:r>
+            <w:r>
+              <w:rPr>
+                <w:rFonts w:ascii="Arial" w:eastAsia="Arial" w:hAnsi="Arial" w:cs="Arial"/>
+                <w:b/>
+                <w:sz w:val="17"/>
+                <w:szCs w:val="17"/>
+              </w:rPr>
+              <w:t>DMMED-${</w:t>
+            </w:r>
+            <w:proofErr w:type="spellStart"/>
+            <w:r>
+              <w:rPr>
+                <w:rFonts w:ascii="Arial" w:eastAsia="Arial" w:hAnsi="Arial" w:cs="Arial"/>
+                <w:b/>
+                <w:sz w:val="17"/>
+                <w:szCs w:val="17"/>
+              </w:rPr>
+              <w:t>anio_contrato</w:t>
+            </w:r>
+            <w:proofErr w:type="spellEnd"/>
+            <w:r>
+              <w:rPr>
+                <w:rFonts w:ascii="Arial" w:eastAsia="Arial" w:hAnsi="Arial" w:cs="Arial"/>
+                <w:b/>
+                <w:sz w:val="17"/>
+                <w:szCs w:val="17"/>
+              </w:rPr>
+              <w:t>}</w:t>
+            </w:r>
           </w:p>
         </w:tc>
       </w:tr>
@@ -1391,14 +1551,16 @@
                 <w:color w:val="000000"/>
                 <w:sz w:val="17"/>
                 <w:szCs w:val="17"/>
+                <w:u w:val="single"/>
               </w:rPr>
             </w:pPr>
             <w:r>
               <w:rPr>
                 <w:rFonts w:ascii="Arial" w:eastAsia="Arial" w:hAnsi="Arial" w:cs="Arial"/>
-                <w:b/>
-                <w:sz w:val="17"/>
-                <w:szCs w:val="17"/>
+                <w:bCs/>
+                <w:sz w:val="17"/>
+                <w:szCs w:val="17"/>
+                <w:u w:val="single"/>
               </w:rPr>
               <w:t>${</w:t>
             </w:r>
@@ -1406,9 +1568,10 @@
             <w:r>
               <w:rPr>
                 <w:rFonts w:ascii="Arial" w:eastAsia="Arial" w:hAnsi="Arial" w:cs="Arial"/>
-                <w:b/>
-                <w:sz w:val="17"/>
-                <w:szCs w:val="17"/>
+                <w:bCs/>
+                <w:sz w:val="17"/>
+                <w:szCs w:val="17"/>
+                <w:u w:val="single"/>
               </w:rPr>
               <w:t>valor_letras</w:t>
             </w:r>
@@ -1416,39 +1579,12 @@
             <w:r>
               <w:rPr>
                 <w:rFonts w:ascii="Arial" w:eastAsia="Arial" w:hAnsi="Arial" w:cs="Arial"/>
-                <w:b/>
-                <w:sz w:val="17"/>
-                <w:szCs w:val="17"/>
-              </w:rPr>
-              <w:t>} (${</w:t>
-            </w:r>
-            <w:proofErr w:type="spellStart"/>
-            <w:r>
-              <w:rPr>
-                <w:rFonts w:ascii="Arial" w:eastAsia="Arial" w:hAnsi="Arial" w:cs="Arial"/>
-                <w:b/>
-                <w:sz w:val="17"/>
-                <w:szCs w:val="17"/>
-              </w:rPr>
-              <w:t>valor_numerico</w:t>
-            </w:r>
-            <w:proofErr w:type="spellEnd"/>
-            <w:r>
-              <w:rPr>
-                <w:rFonts w:ascii="Arial" w:eastAsia="Arial" w:hAnsi="Arial" w:cs="Arial"/>
-                <w:b/>
-                <w:sz w:val="17"/>
-                <w:szCs w:val="17"/>
-              </w:rPr>
-              <w:t xml:space="preserve">}) </w:t>
-            </w:r>
-            <w:r>
-              <w:rPr>
-                <w:rFonts w:ascii="Arial" w:eastAsia="Arial" w:hAnsi="Arial" w:cs="Arial"/>
-                <w:sz w:val="17"/>
-                <w:szCs w:val="17"/>
-              </w:rPr>
-              <w:t>IVA INCLUIDO</w:t>
+                <w:bCs/>
+                <w:sz w:val="17"/>
+                <w:szCs w:val="17"/>
+                <w:u w:val="single"/>
+              </w:rPr>
+              <w:t>}</w:t>
             </w:r>
           </w:p>
         </w:tc>
@@ -1543,11 +1679,13 @@
           </w:tcPr>
           <w:p>
             <w:pPr>
+              <w:ind w:left="709" w:hanging="709"/>
               <w:jc w:val="both"/>
               <w:rPr>
                 <w:rFonts w:ascii="Arial" w:hAnsi="Arial" w:cs="Arial"/>
                 <w:sz w:val="17"/>
                 <w:szCs w:val="17"/>
+                <w:lang w:val="es-ES"/>
               </w:rPr>
             </w:pPr>
             <w:r>
@@ -1556,24 +1694,48 @@
                 <w:sz w:val="17"/>
                 <w:szCs w:val="17"/>
               </w:rPr>
+              <w:t xml:space="preserve">Sargento Viceprimero </w:t>
+            </w:r>
+            <w:r>
+              <w:rPr>
+                <w:rFonts w:ascii="Arial" w:hAnsi="Arial" w:cs="Arial"/>
+                <w:sz w:val="17"/>
+                <w:szCs w:val="17"/>
+                <w:lang w:val="es-ES"/>
+              </w:rPr>
               <w:t>${</w:t>
             </w:r>
+            <w:proofErr w:type="spellStart"/>
             <w:r>
               <w:rPr>
                 <w:rFonts w:ascii="Arial" w:hAnsi="Arial" w:cs="Arial"/>
                 <w:sz w:val="17"/>
                 <w:szCs w:val="17"/>
-              </w:rPr>
-              <w:t>supervisor</w:t>
-            </w:r>
+                <w:lang w:val="es-ES"/>
+              </w:rPr>
+              <w:t>nombre_supervisor</w:t>
+            </w:r>
+            <w:proofErr w:type="spellEnd"/>
             <w:r>
               <w:rPr>
                 <w:rFonts w:ascii="Arial" w:hAnsi="Arial" w:cs="Arial"/>
                 <w:sz w:val="17"/>
                 <w:szCs w:val="17"/>
+                <w:lang w:val="es-ES"/>
               </w:rPr>
               <w:t>}</w:t>
             </w:r>
+          </w:p>
+          <w:p>
+            <w:pPr>
+              <w:ind w:left="709" w:hanging="709"/>
+              <w:jc w:val="both"/>
+              <w:rPr>
+                <w:rFonts w:ascii="Arial" w:hAnsi="Arial" w:cs="Arial"/>
+                <w:sz w:val="17"/>
+                <w:szCs w:val="17"/>
+              </w:rPr>
+            </w:pPr>
           </w:p>
         </w:tc>
       </w:tr>
@@ -2025,6 +2187,44 @@
             <w:r>
               <w:rPr>
                 <w:rFonts w:ascii="Arial" w:eastAsia="Arial" w:hAnsi="Arial" w:cs="Arial"/>
+                <w:b/>
+                <w:sz w:val="17"/>
+                <w:szCs w:val="17"/>
+              </w:rPr>
+              <w:t>-DMMED-</w:t>
+            </w:r>
+            <w:r>
+              <w:rPr>
+                <w:rFonts w:ascii="Arial" w:eastAsia="Arial" w:hAnsi="Arial" w:cs="Arial"/>
+                <w:b/>
+                <w:sz w:val="17"/>
+                <w:szCs w:val="17"/>
+              </w:rPr>
+              <w:t>${</w:t>
+            </w:r>
+            <w:proofErr w:type="spellStart"/>
+            <w:r>
+              <w:rPr>
+                <w:rFonts w:ascii="Arial" w:eastAsia="Arial" w:hAnsi="Arial" w:cs="Arial"/>
+                <w:b/>
+                <w:sz w:val="17"/>
+                <w:szCs w:val="17"/>
+              </w:rPr>
+              <w:t>anio_contrato</w:t>
+            </w:r>
+            <w:proofErr w:type="spellEnd"/>
+            <w:r>
+              <w:rPr>
+                <w:rFonts w:ascii="Arial" w:eastAsia="Arial" w:hAnsi="Arial" w:cs="Arial"/>
+                <w:b/>
+                <w:sz w:val="17"/>
+                <w:szCs w:val="17"/>
+              </w:rPr>
+              <w:t>}</w:t>
+            </w:r>
+            <w:r>
+              <w:rPr>
+                <w:rFonts w:ascii="Arial" w:eastAsia="Arial" w:hAnsi="Arial" w:cs="Arial"/>
                 <w:sz w:val="17"/>
                 <w:szCs w:val="17"/>
               </w:rPr>
@@ -2345,7 +2545,25 @@
           <w:sz w:val="19"/>
           <w:szCs w:val="19"/>
         </w:rPr>
-        <w:t>SP. ${</w:t>
+        <w:t>S</w:t>
+      </w:r>
+      <w:r>
+        <w:rPr>
+          <w:rFonts w:ascii="Arial Narrow" w:eastAsia="Arial Narrow" w:hAnsi="Arial Narrow" w:cs="Arial Narrow"/>
+          <w:b/>
+          <w:sz w:val="19"/>
+          <w:szCs w:val="19"/>
+        </w:rPr>
+        <w:t>argento Viceprimero</w:t>
+      </w:r>
+      <w:r>
+        <w:rPr>
+          <w:rFonts w:ascii="Arial Narrow" w:eastAsia="Arial Narrow" w:hAnsi="Arial Narrow" w:cs="Arial Narrow"/>
+          <w:b/>
+          <w:sz w:val="19"/>
+          <w:szCs w:val="19"/>
+        </w:rPr>
+        <w:t xml:space="preserve"> ${</w:t>
       </w:r>
       <w:proofErr w:type="spellStart"/>
       <w:r>
@@ -2391,42 +2609,62 @@
       </w:r>
       <w:r>
         <w:rPr>
-          <w:rFonts w:ascii="Arial Narrow" w:eastAsia="Arial Narrow" w:hAnsi="Arial Narrow" w:cs="Arial Narrow"/>
+          <w:rFonts w:ascii="Arial" w:eastAsia="Arial" w:hAnsi="Arial" w:cs="Arial"/>
           <w:b/>
-          <w:sz w:val="19"/>
-          <w:szCs w:val="19"/>
+          <w:sz w:val="17"/>
+          <w:szCs w:val="17"/>
         </w:rPr>
         <w:t>${</w:t>
       </w:r>
       <w:proofErr w:type="spellStart"/>
       <w:r>
         <w:rPr>
-          <w:rFonts w:ascii="Arial Narrow" w:eastAsia="Arial Narrow" w:hAnsi="Arial Narrow" w:cs="Arial Narrow"/>
+          <w:rFonts w:ascii="Arial" w:eastAsia="Arial" w:hAnsi="Arial" w:cs="Arial"/>
           <w:b/>
-          <w:sz w:val="19"/>
-          <w:szCs w:val="19"/>
+          <w:sz w:val="17"/>
+          <w:szCs w:val="17"/>
         </w:rPr>
         <w:t>numero_contrato</w:t>
       </w:r>
       <w:proofErr w:type="spellEnd"/>
       <w:r>
         <w:rPr>
-          <w:rFonts w:ascii="Arial Narrow" w:eastAsia="Arial Narrow" w:hAnsi="Arial Narrow" w:cs="Arial Narrow"/>
+          <w:rFonts w:ascii="Arial" w:eastAsia="Arial" w:hAnsi="Arial" w:cs="Arial"/>
           <w:b/>
-          <w:sz w:val="19"/>
-          <w:szCs w:val="19"/>
+          <w:sz w:val="17"/>
+          <w:szCs w:val="17"/>
         </w:rPr>
         <w:t>}</w:t>
       </w:r>
-    </w:p>
-    <w:p>
-      <w:pPr>
+      <w:r>
         <w:rPr>
           <w:rFonts w:ascii="Arial" w:eastAsia="Arial" w:hAnsi="Arial" w:cs="Arial"/>
-          <w:sz w:val="19"/>
-          <w:szCs w:val="19"/>
-        </w:rPr>
-      </w:pPr>
+          <w:b/>
+          <w:sz w:val="17"/>
+          <w:szCs w:val="17"/>
+        </w:rPr>
+        <w:t>-DMMED-${</w:t>
+      </w:r>
+      <w:proofErr w:type="spellStart"/>
+      <w:r>
+        <w:rPr>
+          <w:rFonts w:ascii="Arial" w:eastAsia="Arial" w:hAnsi="Arial" w:cs="Arial"/>
+          <w:b/>
+          <w:sz w:val="17"/>
+          <w:szCs w:val="17"/>
+        </w:rPr>
+        <w:t>anio_contrato</w:t>
+      </w:r>
+      <w:proofErr w:type="spellEnd"/>
+      <w:r>
+        <w:rPr>
+          <w:rFonts w:ascii="Arial" w:eastAsia="Arial" w:hAnsi="Arial" w:cs="Arial"/>
+          <w:b/>
+          <w:sz w:val="17"/>
+          <w:szCs w:val="17"/>
+        </w:rPr>
+        <w:t>}</w:t>
+      </w:r>
     </w:p>
     <w:p>
       <w:pPr>
@@ -6803,7 +7041,6 @@
   <w:style w:type="character" w:default="1" w:styleId="Fuentedeprrafopredeter">
     <w:name w:val="Default Paragraph Font"/>
     <w:uiPriority w:val="1"/>
-    <w:semiHidden/>
     <w:unhideWhenUsed/>
   </w:style>
   <w:style w:type="table" w:default="1" w:styleId="Tablanormal">

</xml_diff>

<commit_message>
Se arreglan errores y se sube folio
</commit_message>
<xml_diff>
--- a/vista/plantilla_acta_inicio_1.docx
+++ b/vista/plantilla_acta_inicio_1.docx
@@ -222,15 +222,7 @@
           <w:b/>
           <w:u w:val="single"/>
         </w:rPr>
-        <w:t>3</w:t>
-      </w:r>
-      <w:r>
-        <w:rPr>
-          <w:rFonts w:ascii="Arial" w:hAnsi="Arial" w:cs="Arial"/>
-          <w:b/>
-          <w:u w:val="single"/>
-        </w:rPr>
-        <w:t>4</w:t>
+        <w:t>${folio}</w:t>
       </w:r>
       <w:r>
         <w:rPr>
@@ -3109,7 +3101,7 @@
           <w:rFonts w:ascii="Arial" w:hAnsi="Arial" w:cs="Arial"/>
           <w:sz w:val="14"/>
           <w:szCs w:val="14"/>
-          <w:lang w:val="en-US" w:eastAsia="es-ES"/>
+          <w:lang w:val="es-ES" w:eastAsia="es-ES"/>
         </w:rPr>
       </w:pPr>
       <w:r>
@@ -7041,6 +7033,7 @@
   <w:style w:type="character" w:default="1" w:styleId="Fuentedeprrafopredeter">
     <w:name w:val="Default Paragraph Font"/>
     <w:uiPriority w:val="1"/>
+    <w:semiHidden/>
     <w:unhideWhenUsed/>
   </w:style>
   <w:style w:type="table" w:default="1" w:styleId="Tablanormal">

</xml_diff>